<commit_message>
Hoàn thành phần 1
</commit_message>
<xml_diff>
--- a/Tuan_04/22657391_VoTrieuAn_Buoi4.docx
+++ b/Tuan_04/22657391_VoTrieuAn_Buoi4.docx
@@ -46,6 +46,7 @@
       </w:pPr>
       <w:r>
         <w:rPr>
+          <w:noProof/>
           <w:sz w:val="26"/>
           <w:szCs w:val="26"/>
         </w:rPr>
@@ -126,6 +127,7 @@
       </w:pPr>
       <w:r>
         <w:rPr>
+          <w:noProof/>
           <w:sz w:val="26"/>
           <w:szCs w:val="26"/>
         </w:rPr>
@@ -192,6 +194,7 @@
       </w:pPr>
       <w:r>
         <w:rPr>
+          <w:noProof/>
           <w:sz w:val="26"/>
           <w:szCs w:val="26"/>
         </w:rPr>
@@ -259,6 +262,7 @@
       </w:pPr>
       <w:r>
         <w:rPr>
+          <w:noProof/>
           <w:sz w:val="26"/>
           <w:szCs w:val="26"/>
         </w:rPr>
@@ -326,6 +330,7 @@
       </w:pPr>
       <w:r>
         <w:rPr>
+          <w:noProof/>
           <w:sz w:val="26"/>
           <w:szCs w:val="26"/>
         </w:rPr>
@@ -392,6 +397,7 @@
       </w:pPr>
       <w:r>
         <w:rPr>
+          <w:noProof/>
           <w:sz w:val="26"/>
           <w:szCs w:val="26"/>
         </w:rPr>
@@ -459,6 +465,7 @@
       </w:pPr>
       <w:r>
         <w:rPr>
+          <w:noProof/>
           <w:sz w:val="26"/>
           <w:szCs w:val="26"/>
         </w:rPr>
@@ -526,6 +533,7 @@
       </w:pPr>
       <w:r>
         <w:rPr>
+          <w:noProof/>
           <w:sz w:val="26"/>
           <w:szCs w:val="26"/>
         </w:rPr>
@@ -592,6 +600,7 @@
       </w:pPr>
       <w:r>
         <w:rPr>
+          <w:noProof/>
           <w:sz w:val="26"/>
           <w:szCs w:val="26"/>
         </w:rPr>
@@ -666,6 +675,7 @@
       </w:pPr>
       <w:r>
         <w:rPr>
+          <w:noProof/>
           <w:sz w:val="26"/>
           <w:szCs w:val="26"/>
         </w:rPr>
@@ -733,6 +743,7 @@
       </w:pPr>
       <w:r>
         <w:rPr>
+          <w:noProof/>
           <w:sz w:val="26"/>
           <w:szCs w:val="26"/>
         </w:rPr>
@@ -799,6 +810,7 @@
       </w:pPr>
       <w:r>
         <w:rPr>
+          <w:noProof/>
           <w:sz w:val="26"/>
           <w:szCs w:val="26"/>
         </w:rPr>
@@ -860,26 +872,20 @@
           <w:sz w:val="26"/>
           <w:szCs w:val="26"/>
         </w:rPr>
-        <w:t xml:space="preserve"> </w:t>
-      </w:r>
-      <w:r>
-        <w:rPr>
-          <w:sz w:val="26"/>
-          <w:szCs w:val="26"/>
-        </w:rPr>
-        <w:t>(Dọn dẹp các container đã stop)</w:t>
-      </w:r>
-    </w:p>
-    <w:p>
-      <w:pPr>
-        <w:pStyle w:val="NormalWeb"/>
-        <w:rPr>
-          <w:sz w:val="26"/>
-          <w:szCs w:val="26"/>
-        </w:rPr>
-      </w:pPr>
-      <w:r>
-        <w:rPr>
+        <w:t xml:space="preserve"> (Dọn dẹp các container đã stop)</w:t>
+      </w:r>
+    </w:p>
+    <w:p>
+      <w:pPr>
+        <w:pStyle w:val="NormalWeb"/>
+        <w:rPr>
+          <w:sz w:val="26"/>
+          <w:szCs w:val="26"/>
+        </w:rPr>
+      </w:pPr>
+      <w:r>
+        <w:rPr>
+          <w:noProof/>
           <w:sz w:val="26"/>
           <w:szCs w:val="26"/>
         </w:rPr>
@@ -947,6 +953,7 @@
       </w:pPr>
       <w:r>
         <w:rPr>
+          <w:noProof/>
           <w:sz w:val="26"/>
           <w:szCs w:val="26"/>
         </w:rPr>
@@ -1013,6 +1020,7 @@
       </w:pPr>
       <w:r>
         <w:rPr>
+          <w:noProof/>
           <w:sz w:val="26"/>
           <w:szCs w:val="26"/>
         </w:rPr>
@@ -1080,6 +1088,7 @@
       </w:pPr>
       <w:r>
         <w:rPr>
+          <w:noProof/>
           <w:sz w:val="26"/>
           <w:szCs w:val="26"/>
         </w:rPr>
@@ -1147,6 +1156,7 @@
       </w:pPr>
       <w:r>
         <w:rPr>
+          <w:noProof/>
           <w:sz w:val="26"/>
           <w:szCs w:val="26"/>
         </w:rPr>
@@ -1213,6 +1223,7 @@
       </w:pPr>
       <w:r>
         <w:rPr>
+          <w:noProof/>
           <w:sz w:val="26"/>
           <w:szCs w:val="26"/>
         </w:rPr>
@@ -1287,6 +1298,7 @@
       </w:pPr>
       <w:r>
         <w:rPr>
+          <w:noProof/>
           <w:sz w:val="26"/>
           <w:szCs w:val="26"/>
         </w:rPr>
@@ -1361,6 +1373,7 @@
       </w:pPr>
       <w:r>
         <w:rPr>
+          <w:noProof/>
           <w:sz w:val="26"/>
           <w:szCs w:val="26"/>
         </w:rPr>
@@ -1427,6 +1440,7 @@
       </w:pPr>
       <w:r>
         <w:rPr>
+          <w:noProof/>
           <w:sz w:val="26"/>
           <w:szCs w:val="26"/>
         </w:rPr>
@@ -1494,6 +1508,7 @@
       </w:pPr>
       <w:r>
         <w:rPr>
+          <w:noProof/>
           <w:sz w:val="26"/>
           <w:szCs w:val="26"/>
         </w:rPr>
@@ -1561,6 +1576,7 @@
       </w:pPr>
       <w:r>
         <w:rPr>
+          <w:noProof/>
           <w:sz w:val="26"/>
           <w:szCs w:val="26"/>
         </w:rPr>
@@ -1627,6 +1643,7 @@
       </w:pPr>
       <w:r>
         <w:rPr>
+          <w:noProof/>
           <w:sz w:val="26"/>
           <w:szCs w:val="26"/>
         </w:rPr>
@@ -1694,6 +1711,7 @@
       </w:pPr>
       <w:r>
         <w:rPr>
+          <w:noProof/>
           <w:sz w:val="26"/>
           <w:szCs w:val="26"/>
         </w:rPr>
@@ -1761,6 +1779,7 @@
       </w:pPr>
       <w:r>
         <w:rPr>
+          <w:noProof/>
           <w:sz w:val="26"/>
           <w:szCs w:val="26"/>
         </w:rPr>
@@ -1827,6 +1846,7 @@
       </w:pPr>
       <w:r>
         <w:rPr>
+          <w:noProof/>
           <w:sz w:val="26"/>
           <w:szCs w:val="26"/>
         </w:rPr>
@@ -1894,6 +1914,7 @@
       </w:pPr>
       <w:r>
         <w:rPr>
+          <w:noProof/>
           <w:sz w:val="26"/>
           <w:szCs w:val="26"/>
         </w:rPr>
@@ -1933,89 +1954,291 @@
           </wp:inline>
         </w:drawing>
       </w:r>
+    </w:p>
+    <w:p>
+      <w:pPr>
+        <w:pStyle w:val="NormalWeb"/>
+        <w:rPr>
+          <w:sz w:val="26"/>
+          <w:szCs w:val="26"/>
+        </w:rPr>
+      </w:pPr>
+      <w:r>
+        <w:rPr>
+          <w:sz w:val="26"/>
+          <w:szCs w:val="26"/>
+        </w:rPr>
+        <w:lastRenderedPageBreak/>
+        <w:t xml:space="preserve">29 FROM nginx </w:t>
+      </w:r>
+    </w:p>
+    <w:p>
+      <w:pPr>
+        <w:pStyle w:val="NormalWeb"/>
+        <w:rPr>
+          <w:sz w:val="26"/>
+          <w:szCs w:val="26"/>
+        </w:rPr>
+      </w:pPr>
+      <w:r>
+        <w:rPr>
+          <w:sz w:val="26"/>
+          <w:szCs w:val="26"/>
+        </w:rPr>
+        <w:t xml:space="preserve">COPY index.html /usr/share/nginx/html/index.html </w:t>
+      </w:r>
+    </w:p>
+    <w:p>
+      <w:pPr>
+        <w:pStyle w:val="NormalWeb"/>
+        <w:rPr>
+          <w:sz w:val="26"/>
+          <w:szCs w:val="26"/>
+        </w:rPr>
+      </w:pPr>
+      <w:r>
+        <w:rPr>
+          <w:sz w:val="26"/>
+          <w:szCs w:val="26"/>
+        </w:rPr>
+        <w:drawing>
+          <wp:inline distT="0" distB="0" distL="0" distR="0" wp14:anchorId="75051993" wp14:editId="0A5F65AE">
+            <wp:extent cx="5943600" cy="4232910"/>
+            <wp:effectExtent l="0" t="0" r="0" b="0"/>
+            <wp:docPr id="30" name="Picture 30"/>
+            <wp:cNvGraphicFramePr>
+              <a:graphicFrameLocks xmlns:a="http://schemas.openxmlformats.org/drawingml/2006/main" noChangeAspect="1"/>
+            </wp:cNvGraphicFramePr>
+            <a:graphic xmlns:a="http://schemas.openxmlformats.org/drawingml/2006/main">
+              <a:graphicData uri="http://schemas.openxmlformats.org/drawingml/2006/picture">
+                <pic:pic xmlns:pic="http://schemas.openxmlformats.org/drawingml/2006/picture">
+                  <pic:nvPicPr>
+                    <pic:cNvPr id="1" name=""/>
+                    <pic:cNvPicPr/>
+                  </pic:nvPicPr>
+                  <pic:blipFill>
+                    <a:blip r:embed="rId32"/>
+                    <a:stretch>
+                      <a:fillRect/>
+                    </a:stretch>
+                  </pic:blipFill>
+                  <pic:spPr>
+                    <a:xfrm>
+                      <a:off x="0" y="0"/>
+                      <a:ext cx="5943600" cy="4232910"/>
+                    </a:xfrm>
+                    <a:prstGeom prst="rect">
+                      <a:avLst/>
+                    </a:prstGeom>
+                  </pic:spPr>
+                </pic:pic>
+              </a:graphicData>
+            </a:graphic>
+          </wp:inline>
+        </w:drawing>
+      </w:r>
+    </w:p>
+    <w:p>
+      <w:pPr>
+        <w:pStyle w:val="NormalWeb"/>
+        <w:rPr>
+          <w:sz w:val="26"/>
+          <w:szCs w:val="26"/>
+        </w:rPr>
+      </w:pPr>
+      <w:r>
+        <w:rPr>
+          <w:sz w:val="26"/>
+          <w:szCs w:val="26"/>
+        </w:rPr>
+        <w:t>30 docker build -t my_nginx_</w:t>
+      </w:r>
+      <w:proofErr w:type="gramStart"/>
+      <w:r>
+        <w:rPr>
+          <w:sz w:val="26"/>
+          <w:szCs w:val="26"/>
+        </w:rPr>
+        <w:t>image .</w:t>
+      </w:r>
+      <w:proofErr w:type="gramEnd"/>
+      <w:r>
+        <w:rPr>
+          <w:sz w:val="26"/>
+          <w:szCs w:val="26"/>
+        </w:rPr>
+        <w:t xml:space="preserve"> </w:t>
+      </w:r>
+    </w:p>
+    <w:p>
+      <w:pPr>
+        <w:pStyle w:val="NormalWeb"/>
+        <w:rPr>
+          <w:sz w:val="26"/>
+          <w:szCs w:val="26"/>
+        </w:rPr>
+      </w:pPr>
+      <w:r>
+        <w:rPr>
+          <w:sz w:val="26"/>
+          <w:szCs w:val="26"/>
+        </w:rPr>
+        <w:lastRenderedPageBreak/>
+        <w:drawing>
+          <wp:inline distT="0" distB="0" distL="0" distR="0" wp14:anchorId="7156408D" wp14:editId="2C1051C8">
+            <wp:extent cx="5943600" cy="3782060"/>
+            <wp:effectExtent l="0" t="0" r="0" b="8890"/>
+            <wp:docPr id="8" name="Picture 8"/>
+            <wp:cNvGraphicFramePr>
+              <a:graphicFrameLocks xmlns:a="http://schemas.openxmlformats.org/drawingml/2006/main" noChangeAspect="1"/>
+            </wp:cNvGraphicFramePr>
+            <a:graphic xmlns:a="http://schemas.openxmlformats.org/drawingml/2006/main">
+              <a:graphicData uri="http://schemas.openxmlformats.org/drawingml/2006/picture">
+                <pic:pic xmlns:pic="http://schemas.openxmlformats.org/drawingml/2006/picture">
+                  <pic:nvPicPr>
+                    <pic:cNvPr id="1" name=""/>
+                    <pic:cNvPicPr/>
+                  </pic:nvPicPr>
+                  <pic:blipFill>
+                    <a:blip r:embed="rId33"/>
+                    <a:stretch>
+                      <a:fillRect/>
+                    </a:stretch>
+                  </pic:blipFill>
+                  <pic:spPr>
+                    <a:xfrm>
+                      <a:off x="0" y="0"/>
+                      <a:ext cx="5943600" cy="3782060"/>
+                    </a:xfrm>
+                    <a:prstGeom prst="rect">
+                      <a:avLst/>
+                    </a:prstGeom>
+                  </pic:spPr>
+                </pic:pic>
+              </a:graphicData>
+            </a:graphic>
+          </wp:inline>
+        </w:drawing>
+      </w:r>
+    </w:p>
+    <w:p>
+      <w:pPr>
+        <w:pStyle w:val="NormalWeb"/>
+        <w:rPr>
+          <w:sz w:val="26"/>
+          <w:szCs w:val="26"/>
+        </w:rPr>
+      </w:pPr>
+      <w:r>
+        <w:rPr>
+          <w:sz w:val="26"/>
+          <w:szCs w:val="26"/>
+        </w:rPr>
+        <w:t xml:space="preserve">31 docker run -d -p 8080:80 my_nginx_image </w:t>
+      </w:r>
+    </w:p>
+    <w:p>
+      <w:pPr>
+        <w:pStyle w:val="NormalWeb"/>
+        <w:rPr>
+          <w:sz w:val="26"/>
+          <w:szCs w:val="26"/>
+        </w:rPr>
+      </w:pPr>
+      <w:r>
+        <w:rPr>
+          <w:sz w:val="26"/>
+          <w:szCs w:val="26"/>
+        </w:rPr>
+        <w:lastRenderedPageBreak/>
+        <w:drawing>
+          <wp:inline distT="0" distB="0" distL="0" distR="0" wp14:anchorId="1422684C" wp14:editId="32902D91">
+            <wp:extent cx="5943600" cy="4963160"/>
+            <wp:effectExtent l="0" t="0" r="0" b="8890"/>
+            <wp:docPr id="31" name="Picture 31"/>
+            <wp:cNvGraphicFramePr>
+              <a:graphicFrameLocks xmlns:a="http://schemas.openxmlformats.org/drawingml/2006/main" noChangeAspect="1"/>
+            </wp:cNvGraphicFramePr>
+            <a:graphic xmlns:a="http://schemas.openxmlformats.org/drawingml/2006/main">
+              <a:graphicData uri="http://schemas.openxmlformats.org/drawingml/2006/picture">
+                <pic:pic xmlns:pic="http://schemas.openxmlformats.org/drawingml/2006/picture">
+                  <pic:nvPicPr>
+                    <pic:cNvPr id="1" name=""/>
+                    <pic:cNvPicPr/>
+                  </pic:nvPicPr>
+                  <pic:blipFill>
+                    <a:blip r:embed="rId34"/>
+                    <a:stretch>
+                      <a:fillRect/>
+                    </a:stretch>
+                  </pic:blipFill>
+                  <pic:spPr>
+                    <a:xfrm>
+                      <a:off x="0" y="0"/>
+                      <a:ext cx="5943600" cy="4963160"/>
+                    </a:xfrm>
+                    <a:prstGeom prst="rect">
+                      <a:avLst/>
+                    </a:prstGeom>
+                  </pic:spPr>
+                </pic:pic>
+              </a:graphicData>
+            </a:graphic>
+          </wp:inline>
+        </w:drawing>
+      </w:r>
+    </w:p>
+    <w:p>
+      <w:pPr>
+        <w:pStyle w:val="NormalWeb"/>
+        <w:rPr>
+          <w:sz w:val="26"/>
+          <w:szCs w:val="26"/>
+        </w:rPr>
+      </w:pPr>
+      <w:r>
+        <w:rPr>
+          <w:sz w:val="26"/>
+          <w:szCs w:val="26"/>
+        </w:rPr>
+        <w:drawing>
+          <wp:inline distT="0" distB="0" distL="0" distR="0" wp14:anchorId="269E7BE6" wp14:editId="3F0EDF43">
+            <wp:extent cx="5943600" cy="3053080"/>
+            <wp:effectExtent l="0" t="0" r="0" b="0"/>
+            <wp:docPr id="32" name="Picture 32"/>
+            <wp:cNvGraphicFramePr>
+              <a:graphicFrameLocks xmlns:a="http://schemas.openxmlformats.org/drawingml/2006/main" noChangeAspect="1"/>
+            </wp:cNvGraphicFramePr>
+            <a:graphic xmlns:a="http://schemas.openxmlformats.org/drawingml/2006/main">
+              <a:graphicData uri="http://schemas.openxmlformats.org/drawingml/2006/picture">
+                <pic:pic xmlns:pic="http://schemas.openxmlformats.org/drawingml/2006/picture">
+                  <pic:nvPicPr>
+                    <pic:cNvPr id="1" name=""/>
+                    <pic:cNvPicPr/>
+                  </pic:nvPicPr>
+                  <pic:blipFill>
+                    <a:blip r:embed="rId35"/>
+                    <a:stretch>
+                      <a:fillRect/>
+                    </a:stretch>
+                  </pic:blipFill>
+                  <pic:spPr>
+                    <a:xfrm>
+                      <a:off x="0" y="0"/>
+                      <a:ext cx="5943600" cy="3053080"/>
+                    </a:xfrm>
+                    <a:prstGeom prst="rect">
+                      <a:avLst/>
+                    </a:prstGeom>
+                  </pic:spPr>
+                </pic:pic>
+              </a:graphicData>
+            </a:graphic>
+          </wp:inline>
+        </w:drawing>
+      </w:r>
       <w:bookmarkStart w:id="0" w:name="_GoBack"/>
       <w:bookmarkEnd w:id="0"/>
-    </w:p>
-    <w:p>
-      <w:pPr>
-        <w:pStyle w:val="NormalWeb"/>
-        <w:rPr>
-          <w:sz w:val="26"/>
-          <w:szCs w:val="26"/>
-        </w:rPr>
-      </w:pPr>
-      <w:r>
-        <w:rPr>
-          <w:sz w:val="26"/>
-          <w:szCs w:val="26"/>
-        </w:rPr>
-        <w:lastRenderedPageBreak/>
-        <w:t xml:space="preserve">29 FROM nginx </w:t>
-      </w:r>
-    </w:p>
-    <w:p>
-      <w:pPr>
-        <w:pStyle w:val="NormalWeb"/>
-        <w:rPr>
-          <w:sz w:val="26"/>
-          <w:szCs w:val="26"/>
-        </w:rPr>
-      </w:pPr>
-      <w:r>
-        <w:rPr>
-          <w:sz w:val="26"/>
-          <w:szCs w:val="26"/>
-        </w:rPr>
-        <w:t xml:space="preserve">COPY index.html /usr/share/nginx/html/index.html </w:t>
-      </w:r>
-    </w:p>
-    <w:p>
-      <w:pPr>
-        <w:pStyle w:val="NormalWeb"/>
-        <w:rPr>
-          <w:sz w:val="26"/>
-          <w:szCs w:val="26"/>
-        </w:rPr>
-      </w:pPr>
-      <w:r>
-        <w:rPr>
-          <w:sz w:val="26"/>
-          <w:szCs w:val="26"/>
-        </w:rPr>
-        <w:t>30 docker build -t my_nginx_</w:t>
-      </w:r>
-      <w:proofErr w:type="gramStart"/>
-      <w:r>
-        <w:rPr>
-          <w:sz w:val="26"/>
-          <w:szCs w:val="26"/>
-        </w:rPr>
-        <w:t>image .</w:t>
-      </w:r>
-      <w:proofErr w:type="gramEnd"/>
-      <w:r>
-        <w:rPr>
-          <w:sz w:val="26"/>
-          <w:szCs w:val="26"/>
-        </w:rPr>
-        <w:t xml:space="preserve"> </w:t>
-      </w:r>
-    </w:p>
-    <w:p>
-      <w:pPr>
-        <w:pStyle w:val="NormalWeb"/>
-        <w:rPr>
-          <w:sz w:val="26"/>
-          <w:szCs w:val="26"/>
-        </w:rPr>
-      </w:pPr>
-      <w:r>
-        <w:rPr>
-          <w:sz w:val="26"/>
-          <w:szCs w:val="26"/>
-        </w:rPr>
-        <w:t xml:space="preserve">31 docker run -d -p 8080:80 my_nginx_image </w:t>
-      </w:r>
     </w:p>
     <w:p>
       <w:pPr>

</xml_diff>